<commit_message>
Load tidyverse and read college data using relative path
</commit_message>
<xml_diff>
--- a/homework_1/homework_1_alex_depamphilis.docx
+++ b/homework_1/homework_1_alex_depamphilis.docx
@@ -23,7 +23,162 @@
         <w:t>The calculated mean of `scores` is 80, meaning the average score of the five exams was 80.</w:t>
       </w:r>
     </w:p>
+    <w:p>
+      <w:r>
+        <w:rPr>
+          <w:noProof/>
+        </w:rPr>
+        <w:drawing>
+          <wp:inline distT="0" distB="0" distL="0" distR="0" wp14:anchorId="7955D52C" wp14:editId="1B6DD96E">
+            <wp:extent cx="5943600" cy="2655570"/>
+            <wp:effectExtent l="0" t="0" r="0" b="0"/>
+            <wp:docPr id="2126095460" name="Picture 1"/>
+            <wp:cNvGraphicFramePr>
+              <a:graphicFrameLocks xmlns:a="http://schemas.openxmlformats.org/drawingml/2006/main" noChangeAspect="1"/>
+            </wp:cNvGraphicFramePr>
+            <a:graphic xmlns:a="http://schemas.openxmlformats.org/drawingml/2006/main">
+              <a:graphicData uri="http://schemas.openxmlformats.org/drawingml/2006/picture">
+                <pic:pic xmlns:pic="http://schemas.openxmlformats.org/drawingml/2006/picture">
+                  <pic:nvPicPr>
+                    <pic:cNvPr id="2126095460" name=""/>
+                    <pic:cNvPicPr/>
+                  </pic:nvPicPr>
+                  <pic:blipFill>
+                    <a:blip r:embed="rId4"/>
+                    <a:stretch>
+                      <a:fillRect/>
+                    </a:stretch>
+                  </pic:blipFill>
+                  <pic:spPr>
+                    <a:xfrm>
+                      <a:off x="0" y="0"/>
+                      <a:ext cx="5943600" cy="2655570"/>
+                    </a:xfrm>
+                    <a:prstGeom prst="rect">
+                      <a:avLst/>
+                    </a:prstGeom>
+                  </pic:spPr>
+                </pic:pic>
+              </a:graphicData>
+            </a:graphic>
+          </wp:inline>
+        </w:drawing>
+      </w:r>
+    </w:p>
     <w:p/>
+    <w:p>
+      <w:r>
+        <w:t>Problem 2:</w:t>
+      </w:r>
+    </w:p>
+    <w:p>
+      <w:r>
+        <w:t xml:space="preserve">The calculated median of `scores` was 84, meaning the middle score of the 5 values was 84. The calculated standard deviation was 9.62, meaning the average distance from the mean was 9.62. These are very different measurements, as the standard deviation gives us insight of the range of scores and how far off the average they were, while the median is a </w:t>
+      </w:r>
+      <w:r>
+        <w:t>straightforward</w:t>
+      </w:r>
+      <w:r>
+        <w:t xml:space="preserve"> measurement, representing the middle score of all the data points, which was 84 in this case (</w:t>
+      </w:r>
+      <w:r>
+        <w:t>3</w:t>
+      </w:r>
+      <w:r>
+        <w:rPr>
+          <w:vertAlign w:val="superscript"/>
+        </w:rPr>
+        <w:t>rd</w:t>
+      </w:r>
+      <w:r>
+        <w:t xml:space="preserve"> highest score out of 5).</w:t>
+      </w:r>
+    </w:p>
+    <w:p>
+      <w:r>
+        <w:drawing>
+          <wp:inline distT="0" distB="0" distL="0" distR="0" wp14:anchorId="7F89C9B2" wp14:editId="55EA7528">
+            <wp:extent cx="5943600" cy="927100"/>
+            <wp:effectExtent l="0" t="0" r="0" b="0"/>
+            <wp:docPr id="2025499601" name="Picture 1"/>
+            <wp:cNvGraphicFramePr>
+              <a:graphicFrameLocks xmlns:a="http://schemas.openxmlformats.org/drawingml/2006/main" noChangeAspect="1"/>
+            </wp:cNvGraphicFramePr>
+            <a:graphic xmlns:a="http://schemas.openxmlformats.org/drawingml/2006/main">
+              <a:graphicData uri="http://schemas.openxmlformats.org/drawingml/2006/picture">
+                <pic:pic xmlns:pic="http://schemas.openxmlformats.org/drawingml/2006/picture">
+                  <pic:nvPicPr>
+                    <pic:cNvPr id="2025499601" name=""/>
+                    <pic:cNvPicPr/>
+                  </pic:nvPicPr>
+                  <pic:blipFill>
+                    <a:blip r:embed="rId5"/>
+                    <a:stretch>
+                      <a:fillRect/>
+                    </a:stretch>
+                  </pic:blipFill>
+                  <pic:spPr>
+                    <a:xfrm>
+                      <a:off x="0" y="0"/>
+                      <a:ext cx="5943600" cy="927100"/>
+                    </a:xfrm>
+                    <a:prstGeom prst="rect">
+                      <a:avLst/>
+                    </a:prstGeom>
+                  </pic:spPr>
+                </pic:pic>
+              </a:graphicData>
+            </a:graphic>
+          </wp:inline>
+        </w:drawing>
+      </w:r>
+    </w:p>
+    <w:p/>
+    <w:p>
+      <w:r>
+        <w:t>Problem 3:</w:t>
+      </w:r>
+    </w:p>
+    <w:p>
+      <w:r>
+        <w:lastRenderedPageBreak/>
+        <w:drawing>
+          <wp:inline distT="0" distB="0" distL="0" distR="0" wp14:anchorId="577AD1BF" wp14:editId="47671B50">
+            <wp:extent cx="5943600" cy="621665"/>
+            <wp:effectExtent l="0" t="0" r="0" b="635"/>
+            <wp:docPr id="1078543507" name="Picture 1"/>
+            <wp:cNvGraphicFramePr>
+              <a:graphicFrameLocks xmlns:a="http://schemas.openxmlformats.org/drawingml/2006/main" noChangeAspect="1"/>
+            </wp:cNvGraphicFramePr>
+            <a:graphic xmlns:a="http://schemas.openxmlformats.org/drawingml/2006/main">
+              <a:graphicData uri="http://schemas.openxmlformats.org/drawingml/2006/picture">
+                <pic:pic xmlns:pic="http://schemas.openxmlformats.org/drawingml/2006/picture">
+                  <pic:nvPicPr>
+                    <pic:cNvPr id="1078543507" name=""/>
+                    <pic:cNvPicPr/>
+                  </pic:nvPicPr>
+                  <pic:blipFill>
+                    <a:blip r:embed="rId6"/>
+                    <a:stretch>
+                      <a:fillRect/>
+                    </a:stretch>
+                  </pic:blipFill>
+                  <pic:spPr>
+                    <a:xfrm>
+                      <a:off x="0" y="0"/>
+                      <a:ext cx="5943600" cy="621665"/>
+                    </a:xfrm>
+                    <a:prstGeom prst="rect">
+                      <a:avLst/>
+                    </a:prstGeom>
+                  </pic:spPr>
+                </pic:pic>
+              </a:graphicData>
+            </a:graphic>
+          </wp:inline>
+        </w:drawing>
+      </w:r>
+    </w:p>
     <w:sectPr>
       <w:pgSz w:w="12240" w:h="15840"/>
       <w:pgMar w:top="1440" w:right="1440" w:bottom="1440" w:left="1440" w:header="720" w:footer="720" w:gutter="0"/>

</xml_diff>